<commit_message>
Sinkronisasi aplikasi, Docker, dan release otomatis
</commit_message>
<xml_diff>
--- a/manual/Manual Aplikasi Ujian Online ZYA CBT - Peserta Tes.docx
+++ b/manual/Manual Aplikasi Ujian Online ZYA CBT - Peserta Tes.docx
@@ -1,6 +1,6 @@
 
 <file path=word/document.xml><?xml version="1.0" encoding="utf-8"?>
-<w:document xmlns:ve="http://schemas.openxmlformats.org/markup-compatibility/2006" xmlns:o="urn:schemas-microsoft-com:office:office" xmlns:r="http://schemas.openxmlformats.org/officeDocument/2006/relationships" xmlns:m="http://schemas.openxmlformats.org/officeDocument/2006/math" xmlns:v="urn:schemas-microsoft-com:vml" xmlns:wp="http://schemas.openxmlformats.org/drawingml/2006/wordprocessingDrawing" xmlns:w10="urn:schemas-microsoft-com:office:word" xmlns:w="http://schemas.openxmlformats.org/wordprocessingml/2006/main" xmlns:wne="http://schemas.microsoft.com/office/word/2006/wordml">
+<w:document xmlns:wpc="http://schemas.microsoft.com/office/word/2010/wordprocessingCanvas" xmlns:mc="http://schemas.openxmlformats.org/markup-compatibility/2006" xmlns:o="urn:schemas-microsoft-com:office:office" xmlns:r="http://schemas.openxmlformats.org/officeDocument/2006/relationships" xmlns:m="http://schemas.openxmlformats.org/officeDocument/2006/math" xmlns:v="urn:schemas-microsoft-com:vml" xmlns:wp14="http://schemas.microsoft.com/office/word/2010/wordprocessingDrawing" xmlns:wp="http://schemas.openxmlformats.org/drawingml/2006/wordprocessingDrawing" xmlns:w10="urn:schemas-microsoft-com:office:word" xmlns:w="http://schemas.openxmlformats.org/wordprocessingml/2006/main" xmlns:w14="http://schemas.microsoft.com/office/word/2010/wordml" xmlns:wpg="http://schemas.microsoft.com/office/word/2010/wordprocessingGroup" xmlns:wpi="http://schemas.microsoft.com/office/word/2010/wordprocessingInk" xmlns:wne="http://schemas.microsoft.com/office/word/2006/wordml" xmlns:wps="http://schemas.microsoft.com/office/word/2010/wordprocessingShape" mc:Ignorable="w14 wp14">
   <w:body>
     <w:p>
       <w:pPr>
@@ -230,8 +230,17 @@
           <w:sz w:val="60"/>
           <w:lang w:val="id-ID"/>
         </w:rPr>
-        <w:t>2020</w:t>
-      </w:r>
+        <w:t>202</w:t>
+      </w:r>
+      <w:r>
+        <w:rPr>
+          <w:b/>
+          <w:sz w:val="60"/>
+        </w:rPr>
+        <w:t>3</w:t>
+      </w:r>
+      <w:bookmarkStart w:id="0" w:name="_GoBack"/>
+      <w:bookmarkEnd w:id="0"/>
       <w:r>
         <w:rPr>
           <w:b/>
@@ -359,7 +368,6 @@
           <w:noProof/>
           <w:sz w:val="24"/>
           <w:szCs w:val="24"/>
-          <w:lang w:val="id-ID" w:eastAsia="id-ID"/>
         </w:rPr>
         <w:drawing>
           <wp:inline distT="0" distB="0" distL="0" distR="0">
@@ -379,7 +387,7 @@
                     </pic:cNvPicPr>
                   </pic:nvPicPr>
                   <pic:blipFill>
-                    <a:blip r:embed="rId7" cstate="print"/>
+                    <a:blip r:embed="rId8" cstate="print"/>
                     <a:srcRect/>
                     <a:stretch>
                       <a:fillRect/>
@@ -541,7 +549,6 @@
           <w:noProof/>
           <w:sz w:val="24"/>
           <w:szCs w:val="24"/>
-          <w:lang w:val="id-ID" w:eastAsia="id-ID"/>
         </w:rPr>
         <w:drawing>
           <wp:inline distT="0" distB="0" distL="0" distR="0">
@@ -561,7 +568,7 @@
                     </pic:cNvPicPr>
                   </pic:nvPicPr>
                   <pic:blipFill>
-                    <a:blip r:embed="rId8" cstate="print"/>
+                    <a:blip r:embed="rId9" cstate="print"/>
                     <a:srcRect/>
                     <a:stretch>
                       <a:fillRect/>
@@ -683,7 +690,6 @@
           <w:noProof/>
           <w:sz w:val="24"/>
           <w:szCs w:val="24"/>
-          <w:lang w:val="id-ID" w:eastAsia="id-ID"/>
         </w:rPr>
         <w:drawing>
           <wp:inline distT="0" distB="0" distL="0" distR="0">
@@ -703,7 +709,7 @@
                     </pic:cNvPicPr>
                   </pic:nvPicPr>
                   <pic:blipFill>
-                    <a:blip r:embed="rId9" cstate="print"/>
+                    <a:blip r:embed="rId10" cstate="print"/>
                     <a:srcRect/>
                     <a:stretch>
                       <a:fillRect/>
@@ -812,7 +818,6 @@
           <w:noProof/>
           <w:sz w:val="24"/>
           <w:szCs w:val="24"/>
-          <w:lang w:val="id-ID" w:eastAsia="id-ID"/>
         </w:rPr>
         <w:drawing>
           <wp:inline distT="0" distB="0" distL="0" distR="0">
@@ -832,7 +837,7 @@
                     </pic:cNvPicPr>
                   </pic:nvPicPr>
                   <pic:blipFill>
-                    <a:blip r:embed="rId10" cstate="print"/>
+                    <a:blip r:embed="rId11" cstate="print"/>
                     <a:srcRect/>
                     <a:stretch>
                       <a:fillRect/>
@@ -1016,7 +1021,6 @@
           <w:noProof/>
           <w:sz w:val="24"/>
           <w:szCs w:val="24"/>
-          <w:lang w:val="id-ID" w:eastAsia="id-ID"/>
         </w:rPr>
         <w:drawing>
           <wp:inline distT="0" distB="0" distL="0" distR="0">
@@ -1036,7 +1040,7 @@
                     </pic:cNvPicPr>
                   </pic:nvPicPr>
                   <pic:blipFill>
-                    <a:blip r:embed="rId11" cstate="print"/>
+                    <a:blip r:embed="rId12" cstate="print"/>
                     <a:srcRect/>
                     <a:stretch>
                       <a:fillRect/>
@@ -1145,7 +1149,6 @@
           <w:noProof/>
           <w:sz w:val="24"/>
           <w:szCs w:val="24"/>
-          <w:lang w:val="id-ID" w:eastAsia="id-ID"/>
         </w:rPr>
         <w:drawing>
           <wp:inline distT="0" distB="0" distL="0" distR="0">
@@ -1165,7 +1168,7 @@
                     </pic:cNvPicPr>
                   </pic:nvPicPr>
                   <pic:blipFill>
-                    <a:blip r:embed="rId12" cstate="print"/>
+                    <a:blip r:embed="rId13" cstate="print"/>
                     <a:srcRect/>
                     <a:stretch>
                       <a:fillRect/>
@@ -1265,8 +1268,8 @@
       </w:r>
     </w:p>
     <w:sectPr>
-      <w:headerReference w:type="default" r:id="rId13"/>
-      <w:footerReference w:type="default" r:id="rId14"/>
+      <w:headerReference w:type="default" r:id="rId14"/>
+      <w:footerReference w:type="default" r:id="rId15"/>
       <w:pgSz w:w="11906" w:h="16838"/>
       <w:pgMar w:top="965" w:right="851" w:bottom="851" w:left="851" w:header="284" w:footer="0" w:gutter="0"/>
       <w:cols w:space="708"/>
@@ -1277,7 +1280,7 @@
 </file>
 
 <file path=word/endnotes.xml><?xml version="1.0" encoding="utf-8"?>
-<w:endnotes xmlns:ve="http://schemas.openxmlformats.org/markup-compatibility/2006" xmlns:o="urn:schemas-microsoft-com:office:office" xmlns:r="http://schemas.openxmlformats.org/officeDocument/2006/relationships" xmlns:m="http://schemas.openxmlformats.org/officeDocument/2006/math" xmlns:v="urn:schemas-microsoft-com:vml" xmlns:wp="http://schemas.openxmlformats.org/drawingml/2006/wordprocessingDrawing" xmlns:w10="urn:schemas-microsoft-com:office:word" xmlns:w="http://schemas.openxmlformats.org/wordprocessingml/2006/main" xmlns:wne="http://schemas.microsoft.com/office/word/2006/wordml">
+<w:endnotes xmlns:wpc="http://schemas.microsoft.com/office/word/2010/wordprocessingCanvas" xmlns:mc="http://schemas.openxmlformats.org/markup-compatibility/2006" xmlns:o="urn:schemas-microsoft-com:office:office" xmlns:r="http://schemas.openxmlformats.org/officeDocument/2006/relationships" xmlns:m="http://schemas.openxmlformats.org/officeDocument/2006/math" xmlns:v="urn:schemas-microsoft-com:vml" xmlns:wp14="http://schemas.microsoft.com/office/word/2010/wordprocessingDrawing" xmlns:wp="http://schemas.openxmlformats.org/drawingml/2006/wordprocessingDrawing" xmlns:w10="urn:schemas-microsoft-com:office:word" xmlns:w="http://schemas.openxmlformats.org/wordprocessingml/2006/main" xmlns:w14="http://schemas.microsoft.com/office/word/2010/wordml" xmlns:wpg="http://schemas.microsoft.com/office/word/2010/wordprocessingGroup" xmlns:wpi="http://schemas.microsoft.com/office/word/2010/wordprocessingInk" xmlns:wne="http://schemas.microsoft.com/office/word/2006/wordml" xmlns:wps="http://schemas.microsoft.com/office/word/2010/wordprocessingShape" mc:Ignorable="w14 wp14">
   <w:endnote w:type="separator" w:id="-1">
     <w:p>
       <w:r>
@@ -1296,7 +1299,7 @@
 </file>
 
 <file path=word/footer1.xml><?xml version="1.0" encoding="utf-8"?>
-<w:ftr xmlns:ve="http://schemas.openxmlformats.org/markup-compatibility/2006" xmlns:o="urn:schemas-microsoft-com:office:office" xmlns:r="http://schemas.openxmlformats.org/officeDocument/2006/relationships" xmlns:m="http://schemas.openxmlformats.org/officeDocument/2006/math" xmlns:v="urn:schemas-microsoft-com:vml" xmlns:wp="http://schemas.openxmlformats.org/drawingml/2006/wordprocessingDrawing" xmlns:w10="urn:schemas-microsoft-com:office:word" xmlns:w="http://schemas.openxmlformats.org/wordprocessingml/2006/main" xmlns:wne="http://schemas.microsoft.com/office/word/2006/wordml">
+<w:ftr xmlns:wpc="http://schemas.microsoft.com/office/word/2010/wordprocessingCanvas" xmlns:mc="http://schemas.openxmlformats.org/markup-compatibility/2006" xmlns:o="urn:schemas-microsoft-com:office:office" xmlns:r="http://schemas.openxmlformats.org/officeDocument/2006/relationships" xmlns:m="http://schemas.openxmlformats.org/officeDocument/2006/math" xmlns:v="urn:schemas-microsoft-com:vml" xmlns:wp14="http://schemas.microsoft.com/office/word/2010/wordprocessingDrawing" xmlns:wp="http://schemas.openxmlformats.org/drawingml/2006/wordprocessingDrawing" xmlns:w10="urn:schemas-microsoft-com:office:word" xmlns:w="http://schemas.openxmlformats.org/wordprocessingml/2006/main" xmlns:w14="http://schemas.microsoft.com/office/word/2010/wordml" xmlns:wpg="http://schemas.microsoft.com/office/word/2010/wordprocessingGroup" xmlns:wpi="http://schemas.microsoft.com/office/word/2010/wordprocessingInk" xmlns:wne="http://schemas.microsoft.com/office/word/2006/wordml" xmlns:wps="http://schemas.microsoft.com/office/word/2010/wordprocessingShape" mc:Ignorable="w14 wp14">
   <w:p/>
   <w:tbl>
     <w:tblPr>
@@ -1310,7 +1313,7 @@
         <w:insideH w:val="none" w:sz="0" w:space="0" w:color="auto"/>
         <w:insideV w:val="none" w:sz="0" w:space="0" w:color="auto"/>
       </w:tblBorders>
-      <w:tblLook w:val="04A0"/>
+      <w:tblLook w:val="04A0" w:firstRow="1" w:lastRow="0" w:firstColumn="1" w:lastColumn="0" w:noHBand="0" w:noVBand="1"/>
     </w:tblPr>
     <w:tblGrid>
       <w:gridCol w:w="5210"/>
@@ -1364,14 +1367,27 @@
               <w:lang w:val="id-ID"/>
             </w:rPr>
           </w:pPr>
-          <w:fldSimple w:instr=" PAGE   \* MERGEFORMAT ">
-            <w:r>
-              <w:rPr>
-                <w:noProof/>
-              </w:rPr>
-              <w:t>1</w:t>
-            </w:r>
-          </w:fldSimple>
+          <w:r>
+            <w:fldChar w:fldCharType="begin"/>
+          </w:r>
+          <w:r>
+            <w:instrText xml:space="preserve"> PAGE   \* MERGEFORMAT </w:instrText>
+          </w:r>
+          <w:r>
+            <w:fldChar w:fldCharType="separate"/>
+          </w:r>
+          <w:r>
+            <w:rPr>
+              <w:noProof/>
+            </w:rPr>
+            <w:t>2</w:t>
+          </w:r>
+          <w:r>
+            <w:rPr>
+              <w:noProof/>
+            </w:rPr>
+            <w:fldChar w:fldCharType="end"/>
+          </w:r>
         </w:p>
       </w:tc>
     </w:tr>
@@ -1388,7 +1404,7 @@
 </file>
 
 <file path=word/footnotes.xml><?xml version="1.0" encoding="utf-8"?>
-<w:footnotes xmlns:ve="http://schemas.openxmlformats.org/markup-compatibility/2006" xmlns:o="urn:schemas-microsoft-com:office:office" xmlns:r="http://schemas.openxmlformats.org/officeDocument/2006/relationships" xmlns:m="http://schemas.openxmlformats.org/officeDocument/2006/math" xmlns:v="urn:schemas-microsoft-com:vml" xmlns:wp="http://schemas.openxmlformats.org/drawingml/2006/wordprocessingDrawing" xmlns:w10="urn:schemas-microsoft-com:office:word" xmlns:w="http://schemas.openxmlformats.org/wordprocessingml/2006/main" xmlns:wne="http://schemas.microsoft.com/office/word/2006/wordml">
+<w:footnotes xmlns:wpc="http://schemas.microsoft.com/office/word/2010/wordprocessingCanvas" xmlns:mc="http://schemas.openxmlformats.org/markup-compatibility/2006" xmlns:o="urn:schemas-microsoft-com:office:office" xmlns:r="http://schemas.openxmlformats.org/officeDocument/2006/relationships" xmlns:m="http://schemas.openxmlformats.org/officeDocument/2006/math" xmlns:v="urn:schemas-microsoft-com:vml" xmlns:wp14="http://schemas.microsoft.com/office/word/2010/wordprocessingDrawing" xmlns:wp="http://schemas.openxmlformats.org/drawingml/2006/wordprocessingDrawing" xmlns:w10="urn:schemas-microsoft-com:office:word" xmlns:w="http://schemas.openxmlformats.org/wordprocessingml/2006/main" xmlns:w14="http://schemas.microsoft.com/office/word/2010/wordml" xmlns:wpg="http://schemas.microsoft.com/office/word/2010/wordprocessingGroup" xmlns:wpi="http://schemas.microsoft.com/office/word/2010/wordprocessingInk" xmlns:wne="http://schemas.microsoft.com/office/word/2006/wordml" xmlns:wps="http://schemas.microsoft.com/office/word/2010/wordprocessingShape" mc:Ignorable="w14 wp14">
   <w:footnote w:type="separator" w:id="-1">
     <w:p>
       <w:r>
@@ -1407,7 +1423,7 @@
 </file>
 
 <file path=word/header1.xml><?xml version="1.0" encoding="utf-8"?>
-<w:hdr xmlns:ve="http://schemas.openxmlformats.org/markup-compatibility/2006" xmlns:o="urn:schemas-microsoft-com:office:office" xmlns:r="http://schemas.openxmlformats.org/officeDocument/2006/relationships" xmlns:m="http://schemas.openxmlformats.org/officeDocument/2006/math" xmlns:v="urn:schemas-microsoft-com:vml" xmlns:wp="http://schemas.openxmlformats.org/drawingml/2006/wordprocessingDrawing" xmlns:w10="urn:schemas-microsoft-com:office:word" xmlns:w="http://schemas.openxmlformats.org/wordprocessingml/2006/main" xmlns:wne="http://schemas.microsoft.com/office/word/2006/wordml">
+<w:hdr xmlns:wpc="http://schemas.microsoft.com/office/word/2010/wordprocessingCanvas" xmlns:mc="http://schemas.openxmlformats.org/markup-compatibility/2006" xmlns:o="urn:schemas-microsoft-com:office:office" xmlns:r="http://schemas.openxmlformats.org/officeDocument/2006/relationships" xmlns:m="http://schemas.openxmlformats.org/officeDocument/2006/math" xmlns:v="urn:schemas-microsoft-com:vml" xmlns:wp14="http://schemas.microsoft.com/office/word/2010/wordprocessingDrawing" xmlns:wp="http://schemas.openxmlformats.org/drawingml/2006/wordprocessingDrawing" xmlns:w10="urn:schemas-microsoft-com:office:word" xmlns:w="http://schemas.openxmlformats.org/wordprocessingml/2006/main" xmlns:w14="http://schemas.microsoft.com/office/word/2010/wordml" xmlns:wpg="http://schemas.microsoft.com/office/word/2010/wordprocessingGroup" xmlns:wpi="http://schemas.microsoft.com/office/word/2010/wordprocessingInk" xmlns:wne="http://schemas.microsoft.com/office/word/2006/wordml" xmlns:wps="http://schemas.microsoft.com/office/word/2010/wordprocessingShape" mc:Ignorable="w14 wp14">
   <w:p>
     <w:pPr>
       <w:pStyle w:val="Header"/>
@@ -1451,7 +1467,7 @@
 </file>
 
 <file path=word/numbering.xml><?xml version="1.0" encoding="utf-8"?>
-<w:numbering xmlns:ve="http://schemas.openxmlformats.org/markup-compatibility/2006" xmlns:o="urn:schemas-microsoft-com:office:office" xmlns:r="http://schemas.openxmlformats.org/officeDocument/2006/relationships" xmlns:m="http://schemas.openxmlformats.org/officeDocument/2006/math" xmlns:v="urn:schemas-microsoft-com:vml" xmlns:wp="http://schemas.openxmlformats.org/drawingml/2006/wordprocessingDrawing" xmlns:w10="urn:schemas-microsoft-com:office:word" xmlns:w="http://schemas.openxmlformats.org/wordprocessingml/2006/main" xmlns:wne="http://schemas.microsoft.com/office/word/2006/wordml">
+<w:numbering xmlns:wpc="http://schemas.microsoft.com/office/word/2010/wordprocessingCanvas" xmlns:mc="http://schemas.openxmlformats.org/markup-compatibility/2006" xmlns:o="urn:schemas-microsoft-com:office:office" xmlns:r="http://schemas.openxmlformats.org/officeDocument/2006/relationships" xmlns:m="http://schemas.openxmlformats.org/officeDocument/2006/math" xmlns:v="urn:schemas-microsoft-com:vml" xmlns:wp14="http://schemas.microsoft.com/office/word/2010/wordprocessingDrawing" xmlns:wp="http://schemas.openxmlformats.org/drawingml/2006/wordprocessingDrawing" xmlns:w10="urn:schemas-microsoft-com:office:word" xmlns:w="http://schemas.openxmlformats.org/wordprocessingml/2006/main" xmlns:w14="http://schemas.microsoft.com/office/word/2010/wordml" xmlns:wpg="http://schemas.microsoft.com/office/word/2010/wordprocessingGroup" xmlns:wpi="http://schemas.microsoft.com/office/word/2010/wordprocessingInk" xmlns:wne="http://schemas.microsoft.com/office/word/2006/wordml" xmlns:wps="http://schemas.microsoft.com/office/word/2010/wordprocessingShape" mc:Ignorable="w14 wp14">
   <w:abstractNum w:abstractNumId="0">
     <w:nsid w:val="021E6F6E"/>
     <w:multiLevelType w:val="hybridMultilevel"/>
@@ -2277,7 +2293,7 @@
 </file>
 
 <file path=word/styles.xml><?xml version="1.0" encoding="utf-8"?>
-<w:styles xmlns:r="http://schemas.openxmlformats.org/officeDocument/2006/relationships" xmlns:w="http://schemas.openxmlformats.org/wordprocessingml/2006/main">
+<w:styles xmlns:mc="http://schemas.openxmlformats.org/markup-compatibility/2006" xmlns:r="http://schemas.openxmlformats.org/officeDocument/2006/relationships" xmlns:w="http://schemas.openxmlformats.org/wordprocessingml/2006/main" xmlns:w14="http://schemas.microsoft.com/office/word/2010/wordml" mc:Ignorable="w14">
   <w:docDefaults>
     <w:rPrDefault>
       <w:rPr>
@@ -2690,7 +2706,6 @@
     <w:uiPriority w:val="99"/>
     <w:semiHidden/>
     <w:unhideWhenUsed/>
-    <w:qFormat/>
     <w:tblPr>
       <w:tblInd w:w="0" w:type="dxa"/>
       <w:tblCellMar>
@@ -2980,6 +2995,196 @@
 </w:styles>
 </file>
 
+<file path=word/stylesWithEffects.xml><?xml version="1.0" encoding="utf-8"?>
+<w:styles xmlns:wpc="http://schemas.microsoft.com/office/word/2010/wordprocessingCanvas" xmlns:mc="http://schemas.openxmlformats.org/markup-compatibility/2006" xmlns:o="urn:schemas-microsoft-com:office:office" xmlns:r="http://schemas.openxmlformats.org/officeDocument/2006/relationships" xmlns:m="http://schemas.openxmlformats.org/officeDocument/2006/math" xmlns:v="urn:schemas-microsoft-com:vml" xmlns:wp14="http://schemas.microsoft.com/office/word/2010/wordprocessingDrawing" xmlns:wp="http://schemas.openxmlformats.org/drawingml/2006/wordprocessingDrawing" xmlns:w10="urn:schemas-microsoft-com:office:word" xmlns:w="http://schemas.openxmlformats.org/wordprocessingml/2006/main" xmlns:w14="http://schemas.microsoft.com/office/word/2010/wordml" xmlns:wpg="http://schemas.microsoft.com/office/word/2010/wordprocessingGroup" xmlns:wpi="http://schemas.microsoft.com/office/word/2010/wordprocessingInk" xmlns:wne="http://schemas.microsoft.com/office/word/2006/wordml" xmlns:wps="http://schemas.microsoft.com/office/word/2010/wordprocessingShape" mc:Ignorable="w14 wp14">
+  <w:docDefaults>
+    <w:rPrDefault>
+      <w:rPr>
+        <w:rFonts w:asciiTheme="minorHAnsi" w:eastAsiaTheme="minorEastAsia" w:hAnsiTheme="minorHAnsi" w:cstheme="minorBidi"/>
+        <w:sz w:val="22"/>
+        <w:szCs w:val="22"/>
+        <w:lang w:val="en-US" w:eastAsia="en-US" w:bidi="ar-SA"/>
+      </w:rPr>
+    </w:rPrDefault>
+    <w:pPrDefault>
+      <w:pPr>
+        <w:spacing w:after="200" w:line="276" w:lineRule="auto"/>
+      </w:pPr>
+    </w:pPrDefault>
+  </w:docDefaults>
+  <w:latentStyles w:defLockedState="0" w:defUIPriority="99" w:defSemiHidden="1" w:defUnhideWhenUsed="1" w:defQFormat="0" w:count="267">
+    <w:lsdException w:name="Normal" w:semiHidden="0" w:uiPriority="0" w:unhideWhenUsed="0" w:qFormat="1"/>
+    <w:lsdException w:name="heading 1" w:semiHidden="0" w:uiPriority="9" w:unhideWhenUsed="0" w:qFormat="1"/>
+    <w:lsdException w:name="heading 2" w:uiPriority="9" w:qFormat="1"/>
+    <w:lsdException w:name="heading 3" w:uiPriority="9" w:qFormat="1"/>
+    <w:lsdException w:name="heading 4" w:uiPriority="9" w:qFormat="1"/>
+    <w:lsdException w:name="heading 5" w:uiPriority="9" w:qFormat="1"/>
+    <w:lsdException w:name="heading 6" w:uiPriority="9" w:qFormat="1"/>
+    <w:lsdException w:name="heading 7" w:uiPriority="9" w:qFormat="1"/>
+    <w:lsdException w:name="heading 8" w:uiPriority="9" w:qFormat="1"/>
+    <w:lsdException w:name="heading 9" w:uiPriority="9" w:qFormat="1"/>
+    <w:lsdException w:name="toc 1" w:uiPriority="39"/>
+    <w:lsdException w:name="toc 2" w:uiPriority="39"/>
+    <w:lsdException w:name="toc 3" w:uiPriority="39"/>
+    <w:lsdException w:name="toc 4" w:uiPriority="39"/>
+    <w:lsdException w:name="toc 5" w:uiPriority="39"/>
+    <w:lsdException w:name="toc 6" w:uiPriority="39"/>
+    <w:lsdException w:name="toc 7" w:uiPriority="39"/>
+    <w:lsdException w:name="toc 8" w:uiPriority="39"/>
+    <w:lsdException w:name="toc 9" w:uiPriority="39"/>
+    <w:lsdException w:name="caption" w:uiPriority="35" w:qFormat="1"/>
+    <w:lsdException w:name="Title" w:semiHidden="0" w:uiPriority="10" w:unhideWhenUsed="0" w:qFormat="1"/>
+    <w:lsdException w:name="Default Paragraph Font" w:uiPriority="1"/>
+    <w:lsdException w:name="Subtitle" w:semiHidden="0" w:uiPriority="11" w:unhideWhenUsed="0" w:qFormat="1"/>
+    <w:lsdException w:name="Strong" w:semiHidden="0" w:uiPriority="22" w:unhideWhenUsed="0" w:qFormat="1"/>
+    <w:lsdException w:name="Emphasis" w:semiHidden="0" w:uiPriority="20" w:unhideWhenUsed="0" w:qFormat="1"/>
+    <w:lsdException w:name="Table Grid" w:semiHidden="0" w:uiPriority="59" w:unhideWhenUsed="0"/>
+    <w:lsdException w:name="Placeholder Text" w:unhideWhenUsed="0"/>
+    <w:lsdException w:name="No Spacing" w:semiHidden="0" w:uiPriority="1" w:unhideWhenUsed="0" w:qFormat="1"/>
+    <w:lsdException w:name="Light Shading" w:semiHidden="0" w:uiPriority="60" w:unhideWhenUsed="0"/>
+    <w:lsdException w:name="Light List" w:semiHidden="0" w:uiPriority="61" w:unhideWhenUsed="0"/>
+    <w:lsdException w:name="Light Grid" w:semiHidden="0" w:uiPriority="62" w:unhideWhenUsed="0"/>
+    <w:lsdException w:name="Medium Shading 1" w:semiHidden="0" w:uiPriority="63" w:unhideWhenUsed="0"/>
+    <w:lsdException w:name="Medium Shading 2" w:semiHidden="0" w:uiPriority="64" w:unhideWhenUsed="0"/>
+    <w:lsdException w:name="Medium List 1" w:semiHidden="0" w:uiPriority="65" w:unhideWhenUsed="0"/>
+    <w:lsdException w:name="Medium List 2" w:semiHidden="0" w:uiPriority="66" w:unhideWhenUsed="0"/>
+    <w:lsdException w:name="Medium Grid 1" w:semiHidden="0" w:uiPriority="67" w:unhideWhenUsed="0"/>
+    <w:lsdException w:name="Medium Grid 2" w:semiHidden="0" w:uiPriority="68" w:unhideWhenUsed="0"/>
+    <w:lsdException w:name="Medium Grid 3" w:semiHidden="0" w:uiPriority="69" w:unhideWhenUsed="0"/>
+    <w:lsdException w:name="Dark List" w:semiHidden="0" w:uiPriority="70" w:unhideWhenUsed="0"/>
+    <w:lsdException w:name="Colorful Shading" w:semiHidden="0" w:uiPriority="71" w:unhideWhenUsed="0"/>
+    <w:lsdException w:name="Colorful List" w:semiHidden="0" w:uiPriority="72" w:unhideWhenUsed="0"/>
+    <w:lsdException w:name="Colorful Grid" w:semiHidden="0" w:uiPriority="73" w:unhideWhenUsed="0"/>
+    <w:lsdException w:name="Light Shading Accent 1" w:semiHidden="0" w:uiPriority="60" w:unhideWhenUsed="0"/>
+    <w:lsdException w:name="Light List Accent 1" w:semiHidden="0" w:uiPriority="61" w:unhideWhenUsed="0"/>
+    <w:lsdException w:name="Light Grid Accent 1" w:semiHidden="0" w:uiPriority="62" w:unhideWhenUsed="0"/>
+    <w:lsdException w:name="Medium Shading 1 Accent 1" w:semiHidden="0" w:uiPriority="63" w:unhideWhenUsed="0"/>
+    <w:lsdException w:name="Medium Shading 2 Accent 1" w:semiHidden="0" w:uiPriority="64" w:unhideWhenUsed="0"/>
+    <w:lsdException w:name="Medium List 1 Accent 1" w:semiHidden="0" w:uiPriority="65" w:unhideWhenUsed="0"/>
+    <w:lsdException w:name="Revision" w:unhideWhenUsed="0"/>
+    <w:lsdException w:name="List Paragraph" w:semiHidden="0" w:uiPriority="34" w:unhideWhenUsed="0" w:qFormat="1"/>
+    <w:lsdException w:name="Quote" w:semiHidden="0" w:uiPriority="29" w:unhideWhenUsed="0" w:qFormat="1"/>
+    <w:lsdException w:name="Intense Quote" w:semiHidden="0" w:uiPriority="30" w:unhideWhenUsed="0" w:qFormat="1"/>
+    <w:lsdException w:name="Medium List 2 Accent 1" w:semiHidden="0" w:uiPriority="66" w:unhideWhenUsed="0"/>
+    <w:lsdException w:name="Medium Grid 1 Accent 1" w:semiHidden="0" w:uiPriority="67" w:unhideWhenUsed="0"/>
+    <w:lsdException w:name="Medium Grid 2 Accent 1" w:semiHidden="0" w:uiPriority="68" w:unhideWhenUsed="0"/>
+    <w:lsdException w:name="Medium Grid 3 Accent 1" w:semiHidden="0" w:uiPriority="69" w:unhideWhenUsed="0"/>
+    <w:lsdException w:name="Dark List Accent 1" w:semiHidden="0" w:uiPriority="70" w:unhideWhenUsed="0"/>
+    <w:lsdException w:name="Colorful Shading Accent 1" w:semiHidden="0" w:uiPriority="71" w:unhideWhenUsed="0"/>
+    <w:lsdException w:name="Colorful List Accent 1" w:semiHidden="0" w:uiPriority="72" w:unhideWhenUsed="0"/>
+    <w:lsdException w:name="Colorful Grid Accent 1" w:semiHidden="0" w:uiPriority="73" w:unhideWhenUsed="0"/>
+    <w:lsdException w:name="Light Shading Accent 2" w:semiHidden="0" w:uiPriority="60" w:unhideWhenUsed="0"/>
+    <w:lsdException w:name="Light List Accent 2" w:semiHidden="0" w:uiPriority="61" w:unhideWhenUsed="0"/>
+    <w:lsdException w:name="Light Grid Accent 2" w:semiHidden="0" w:uiPriority="62" w:unhideWhenUsed="0"/>
+    <w:lsdException w:name="Medium Shading 1 Accent 2" w:semiHidden="0" w:uiPriority="63" w:unhideWhenUsed="0"/>
+    <w:lsdException w:name="Medium Shading 2 Accent 2" w:semiHidden="0" w:uiPriority="64" w:unhideWhenUsed="0"/>
+    <w:lsdException w:name="Medium List 1 Accent 2" w:semiHidden="0" w:uiPriority="65" w:unhideWhenUsed="0"/>
+    <w:lsdException w:name="Medium List 2 Accent 2" w:semiHidden="0" w:uiPriority="66" w:unhideWhenUsed="0"/>
+    <w:lsdException w:name="Medium Grid 1 Accent 2" w:semiHidden="0" w:uiPriority="67" w:unhideWhenUsed="0"/>
+    <w:lsdException w:name="Medium Grid 2 Accent 2" w:semiHidden="0" w:uiPriority="68" w:unhideWhenUsed="0"/>
+    <w:lsdException w:name="Medium Grid 3 Accent 2" w:semiHidden="0" w:uiPriority="69" w:unhideWhenUsed="0"/>
+    <w:lsdException w:name="Dark List Accent 2" w:semiHidden="0" w:uiPriority="70" w:unhideWhenUsed="0"/>
+    <w:lsdException w:name="Colorful Shading Accent 2" w:semiHidden="0" w:uiPriority="71" w:unhideWhenUsed="0"/>
+    <w:lsdException w:name="Colorful List Accent 2" w:semiHidden="0" w:uiPriority="72" w:unhideWhenUsed="0"/>
+    <w:lsdException w:name="Colorful Grid Accent 2" w:semiHidden="0" w:uiPriority="73" w:unhideWhenUsed="0"/>
+    <w:lsdException w:name="Light Shading Accent 3" w:semiHidden="0" w:uiPriority="60" w:unhideWhenUsed="0"/>
+    <w:lsdException w:name="Light List Accent 3" w:semiHidden="0" w:uiPriority="61" w:unhideWhenUsed="0"/>
+    <w:lsdException w:name="Light Grid Accent 3" w:semiHidden="0" w:uiPriority="62" w:unhideWhenUsed="0"/>
+    <w:lsdException w:name="Medium Shading 1 Accent 3" w:semiHidden="0" w:uiPriority="63" w:unhideWhenUsed="0"/>
+    <w:lsdException w:name="Medium Shading 2 Accent 3" w:semiHidden="0" w:uiPriority="64" w:unhideWhenUsed="0"/>
+    <w:lsdException w:name="Medium List 1 Accent 3" w:semiHidden="0" w:uiPriority="65" w:unhideWhenUsed="0"/>
+    <w:lsdException w:name="Medium List 2 Accent 3" w:semiHidden="0" w:uiPriority="66" w:unhideWhenUsed="0"/>
+    <w:lsdException w:name="Medium Grid 1 Accent 3" w:semiHidden="0" w:uiPriority="67" w:unhideWhenUsed="0"/>
+    <w:lsdException w:name="Medium Grid 2 Accent 3" w:semiHidden="0" w:uiPriority="68" w:unhideWhenUsed="0"/>
+    <w:lsdException w:name="Medium Grid 3 Accent 3" w:semiHidden="0" w:uiPriority="69" w:unhideWhenUsed="0"/>
+    <w:lsdException w:name="Dark List Accent 3" w:semiHidden="0" w:uiPriority="70" w:unhideWhenUsed="0"/>
+    <w:lsdException w:name="Colorful Shading Accent 3" w:semiHidden="0" w:uiPriority="71" w:unhideWhenUsed="0"/>
+    <w:lsdException w:name="Colorful List Accent 3" w:semiHidden="0" w:uiPriority="72" w:unhideWhenUsed="0"/>
+    <w:lsdException w:name="Colorful Grid Accent 3" w:semiHidden="0" w:uiPriority="73" w:unhideWhenUsed="0"/>
+    <w:lsdException w:name="Light Shading Accent 4" w:semiHidden="0" w:uiPriority="60" w:unhideWhenUsed="0"/>
+    <w:lsdException w:name="Light List Accent 4" w:semiHidden="0" w:uiPriority="61" w:unhideWhenUsed="0"/>
+    <w:lsdException w:name="Light Grid Accent 4" w:semiHidden="0" w:uiPriority="62" w:unhideWhenUsed="0"/>
+    <w:lsdException w:name="Medium Shading 1 Accent 4" w:semiHidden="0" w:uiPriority="63" w:unhideWhenUsed="0"/>
+    <w:lsdException w:name="Medium Shading 2 Accent 4" w:semiHidden="0" w:uiPriority="64" w:unhideWhenUsed="0"/>
+    <w:lsdException w:name="Medium List 1 Accent 4" w:semiHidden="0" w:uiPriority="65" w:unhideWhenUsed="0"/>
+    <w:lsdException w:name="Medium List 2 Accent 4" w:semiHidden="0" w:uiPriority="66" w:unhideWhenUsed="0"/>
+    <w:lsdException w:name="Medium Grid 1 Accent 4" w:semiHidden="0" w:uiPriority="67" w:unhideWhenUsed="0"/>
+    <w:lsdException w:name="Medium Grid 2 Accent 4" w:semiHidden="0" w:uiPriority="68" w:unhideWhenUsed="0"/>
+    <w:lsdException w:name="Medium Grid 3 Accent 4" w:semiHidden="0" w:uiPriority="69" w:unhideWhenUsed="0"/>
+    <w:lsdException w:name="Dark List Accent 4" w:semiHidden="0" w:uiPriority="70" w:unhideWhenUsed="0"/>
+    <w:lsdException w:name="Colorful Shading Accent 4" w:semiHidden="0" w:uiPriority="71" w:unhideWhenUsed="0"/>
+    <w:lsdException w:name="Colorful List Accent 4" w:semiHidden="0" w:uiPriority="72" w:unhideWhenUsed="0"/>
+    <w:lsdException w:name="Colorful Grid Accent 4" w:semiHidden="0" w:uiPriority="73" w:unhideWhenUsed="0"/>
+    <w:lsdException w:name="Light Shading Accent 5" w:semiHidden="0" w:uiPriority="60" w:unhideWhenUsed="0"/>
+    <w:lsdException w:name="Light List Accent 5" w:semiHidden="0" w:uiPriority="61" w:unhideWhenUsed="0"/>
+    <w:lsdException w:name="Light Grid Accent 5" w:semiHidden="0" w:uiPriority="62" w:unhideWhenUsed="0"/>
+    <w:lsdException w:name="Medium Shading 1 Accent 5" w:semiHidden="0" w:uiPriority="63" w:unhideWhenUsed="0"/>
+    <w:lsdException w:name="Medium Shading 2 Accent 5" w:semiHidden="0" w:uiPriority="64" w:unhideWhenUsed="0"/>
+    <w:lsdException w:name="Medium List 1 Accent 5" w:semiHidden="0" w:uiPriority="65" w:unhideWhenUsed="0"/>
+    <w:lsdException w:name="Medium List 2 Accent 5" w:semiHidden="0" w:uiPriority="66" w:unhideWhenUsed="0"/>
+    <w:lsdException w:name="Medium Grid 1 Accent 5" w:semiHidden="0" w:uiPriority="67" w:unhideWhenUsed="0"/>
+    <w:lsdException w:name="Medium Grid 2 Accent 5" w:semiHidden="0" w:uiPriority="68" w:unhideWhenUsed="0"/>
+    <w:lsdException w:name="Medium Grid 3 Accent 5" w:semiHidden="0" w:uiPriority="69" w:unhideWhenUsed="0"/>
+    <w:lsdException w:name="Dark List Accent 5" w:semiHidden="0" w:uiPriority="70" w:unhideWhenUsed="0"/>
+    <w:lsdException w:name="Colorful Shading Accent 5" w:semiHidden="0" w:uiPriority="71" w:unhideWhenUsed="0"/>
+    <w:lsdException w:name="Colorful List Accent 5" w:semiHidden="0" w:uiPriority="72" w:unhideWhenUsed="0"/>
+    <w:lsdException w:name="Colorful Grid Accent 5" w:semiHidden="0" w:uiPriority="73" w:unhideWhenUsed="0"/>
+    <w:lsdException w:name="Light Shading Accent 6" w:semiHidden="0" w:uiPriority="60" w:unhideWhenUsed="0"/>
+    <w:lsdException w:name="Light List Accent 6" w:semiHidden="0" w:uiPriority="61" w:unhideWhenUsed="0"/>
+    <w:lsdException w:name="Light Grid Accent 6" w:semiHidden="0" w:uiPriority="62" w:unhideWhenUsed="0"/>
+    <w:lsdException w:name="Medium Shading 1 Accent 6" w:semiHidden="0" w:uiPriority="63" w:unhideWhenUsed="0"/>
+    <w:lsdException w:name="Medium Shading 2 Accent 6" w:semiHidden="0" w:uiPriority="64" w:unhideWhenUsed="0"/>
+    <w:lsdException w:name="Medium List 1 Accent 6" w:semiHidden="0" w:uiPriority="65" w:unhideWhenUsed="0"/>
+    <w:lsdException w:name="Medium List 2 Accent 6" w:semiHidden="0" w:uiPriority="66" w:unhideWhenUsed="0"/>
+    <w:lsdException w:name="Medium Grid 1 Accent 6" w:semiHidden="0" w:uiPriority="67" w:unhideWhenUsed="0"/>
+    <w:lsdException w:name="Medium Grid 2 Accent 6" w:semiHidden="0" w:uiPriority="68" w:unhideWhenUsed="0"/>
+    <w:lsdException w:name="Medium Grid 3 Accent 6" w:semiHidden="0" w:uiPriority="69" w:unhideWhenUsed="0"/>
+    <w:lsdException w:name="Dark List Accent 6" w:semiHidden="0" w:uiPriority="70" w:unhideWhenUsed="0"/>
+    <w:lsdException w:name="Colorful Shading Accent 6" w:semiHidden="0" w:uiPriority="71" w:unhideWhenUsed="0"/>
+    <w:lsdException w:name="Colorful List Accent 6" w:semiHidden="0" w:uiPriority="72" w:unhideWhenUsed="0"/>
+    <w:lsdException w:name="Colorful Grid Accent 6" w:semiHidden="0" w:uiPriority="73" w:unhideWhenUsed="0"/>
+    <w:lsdException w:name="Subtle Emphasis" w:semiHidden="0" w:uiPriority="19" w:unhideWhenUsed="0" w:qFormat="1"/>
+    <w:lsdException w:name="Intense Emphasis" w:semiHidden="0" w:uiPriority="21" w:unhideWhenUsed="0" w:qFormat="1"/>
+    <w:lsdException w:name="Subtle Reference" w:semiHidden="0" w:uiPriority="31" w:unhideWhenUsed="0" w:qFormat="1"/>
+    <w:lsdException w:name="Intense Reference" w:semiHidden="0" w:uiPriority="32" w:unhideWhenUsed="0" w:qFormat="1"/>
+    <w:lsdException w:name="Book Title" w:semiHidden="0" w:uiPriority="33" w:unhideWhenUsed="0" w:qFormat="1"/>
+    <w:lsdException w:name="Bibliography" w:uiPriority="37"/>
+    <w:lsdException w:name="TOC Heading" w:uiPriority="39" w:qFormat="1"/>
+  </w:latentStyles>
+  <w:style w:type="paragraph" w:default="1" w:styleId="Normal">
+    <w:name w:val="Normal"/>
+    <w:qFormat/>
+  </w:style>
+  <w:style w:type="character" w:default="1" w:styleId="DefaultParagraphFont">
+    <w:name w:val="Default Paragraph Font"/>
+    <w:uiPriority w:val="1"/>
+    <w:semiHidden/>
+    <w:unhideWhenUsed/>
+  </w:style>
+  <w:style w:type="table" w:default="1" w:styleId="TableNormal">
+    <w:name w:val="Normal Table"/>
+    <w:uiPriority w:val="99"/>
+    <w:semiHidden/>
+    <w:unhideWhenUsed/>
+    <w:tblPr>
+      <w:tblInd w:w="0" w:type="dxa"/>
+      <w:tblCellMar>
+        <w:top w:w="0" w:type="dxa"/>
+        <w:left w:w="108" w:type="dxa"/>
+        <w:bottom w:w="0" w:type="dxa"/>
+        <w:right w:w="108" w:type="dxa"/>
+      </w:tblCellMar>
+    </w:tblPr>
+  </w:style>
+  <w:style w:type="numbering" w:default="1" w:styleId="NoList">
+    <w:name w:val="No List"/>
+    <w:uiPriority w:val="99"/>
+    <w:semiHidden/>
+    <w:unhideWhenUsed/>
+  </w:style>
+</w:styles>
+</file>
+
 <file path=word/theme/theme1.xml><?xml version="1.0" encoding="utf-8"?>
 <a:theme xmlns:a="http://schemas.openxmlformats.org/drawingml/2006/main" name="Office Theme">
   <a:themeElements>

</xml_diff>